<commit_message>
Update GameNetworkService description for clarity
</commit_message>
<xml_diff>
--- a/מסמך תכנון.docx
+++ b/מסמך תכנון.docx
@@ -935,7 +935,7 @@
       <w:pPr>
         <w:pStyle w:val="a9"/>
         <w:rPr>
-          <w:rFonts w:cs="Arial" w:hint="cs"/>
+          <w:rFonts w:cs="Arial"/>
           <w:rtl/>
         </w:rPr>
       </w:pPr>
@@ -1217,7 +1217,21 @@
           <w:rFonts w:cs="Arial"/>
           <w:rtl/>
         </w:rPr>
-        <w:t>: שירות רשת המשמש לניהול קריאות כלליות מול השרת הנוגעות למצב המשחקים, ככל הנראה לטובת חיבור ותקשורת בסיסית.</w:t>
+        <w:t>: שירות רשת המשמש לניהול קריאות כלליות מול השרת הנוגעות למצב המשחקים</w:t>
+      </w:r>
+      <w:r>
+        <w:rPr>
+          <w:rFonts w:cs="Arial" w:hint="cs"/>
+          <w:rtl/>
+        </w:rPr>
+        <w:t xml:space="preserve"> </w:t>
+      </w:r>
+      <w:r>
+        <w:rPr>
+          <w:rFonts w:cs="Arial"/>
+          <w:rtl/>
+        </w:rPr>
+        <w:t>לטובת חיבור ותקשורת בסיסית.</w:t>
       </w:r>
     </w:p>
     <w:p>
@@ -1752,7 +1766,7 @@
       <w:pPr>
         <w:pStyle w:val="a9"/>
         <w:rPr>
-          <w:rFonts w:cs="Arial" w:hint="cs"/>
+          <w:rFonts w:cs="Arial"/>
           <w:rtl/>
         </w:rPr>
       </w:pPr>
@@ -1882,7 +1896,7 @@
       <w:pPr>
         <w:pStyle w:val="a9"/>
         <w:rPr>
-          <w:rFonts w:cs="Arial" w:hint="cs"/>
+          <w:rFonts w:cs="Arial"/>
           <w:rtl/>
         </w:rPr>
       </w:pPr>
@@ -2059,7 +2073,7 @@
       <w:pPr>
         <w:pStyle w:val="a9"/>
         <w:rPr>
-          <w:rFonts w:cs="Arial" w:hint="cs"/>
+          <w:rFonts w:cs="Arial"/>
           <w:rtl/>
         </w:rPr>
       </w:pPr>
@@ -3134,6 +3148,7 @@
   <w:style w:type="character" w:default="1" w:styleId="a0">
     <w:name w:val="Default Paragraph Font"/>
     <w:uiPriority w:val="1"/>
+    <w:semiHidden/>
     <w:unhideWhenUsed/>
   </w:style>
   <w:style w:type="table" w:default="1" w:styleId="a1">

</xml_diff>